<commit_message>
Freeze table headers (and DataTable totals row) while scrolling long lists and reports
Co-Authored-By: Claude Sonnet 5.5 <noreply@anthropic.com>
Claude-Session: https://claude.ai/code/session_01611rAAsm4xgneCTG3N9mPf
</commit_message>
<xml_diff>
--- a/docs/printable/GWS-ERP-User-Guide.docx
+++ b/docs/printable/GWS-ERP-User-Guide.docx
@@ -13726,7 +13726,25 @@
           <w:sz w:val="20"/>
           <w:szCs w:val="20"/>
         </w:rPr>
-        <w:t xml:space="preserve"> box above it. Type part of a name, a number, a product, a branch or a date: every word you type must appear in the row (in any order), and the other rows are hidden. Clear the box to see everything again. A search on the list only looks at what is loaded; on </w:t>
+        <w:t xml:space="preserve"> box above it. Type part of a name, a number, a product, a branch or a date: every word you type must appear in the row (in any order), and the other rows are hidden. Clear the box to see everything again. In long lists the </w:t>
+      </w:r>
+      <w:r>
+        <w:rPr>
+          <w:rFonts w:ascii="Arial" w:cs="Arial" w:eastAsia="Arial" w:hAnsi="Arial"/>
+          <w:b/>
+          <w:bCs/>
+          <w:sz w:val="20"/>
+          <w:szCs w:val="20"/>
+        </w:rPr>
+        <w:t xml:space="preserve">column titles stay frozen</w:t>
+      </w:r>
+      <w:r>
+        <w:rPr>
+          <w:rFonts w:ascii="Arial" w:cs="Arial" w:eastAsia="Arial" w:hAnsi="Arial"/>
+          <w:sz w:val="20"/>
+          <w:szCs w:val="20"/>
+        </w:rPr>
+        <w:t xml:space="preserve"> at the top while you scroll the rows (and the totals row stays at the bottom), so you always see which column is which. A search on the list only looks at what is loaded; on </w:t>
       </w:r>
       <w:r>
         <w:rPr>

</xml_diff>

<commit_message>
Replacement price difference: how it was paid (cash, online, card) and the day, shown in the Daily Sales Report as replacement payments, closed days approved by the Head Auditor; the replacement is dated the day given; chosen items shown inside search boxes; prices auto-filled and editable (replacement, member / promo prices at New Sale); guides, decisions, simulation steps and acceptance tests
Co-Authored-By: Claude Sonnet 5.5 <noreply@anthropic.com>
Claude-Session: https://claude.ai/code/session_01611rAAsm4xgneCTG3N9mPf
</commit_message>
<xml_diff>
--- a/docs/printable/GWS-ERP-User-Guide.docx
+++ b/docs/printable/GWS-ERP-User-Guide.docx
@@ -73,7 +73,7 @@
           <w:sz w:val="20"/>
           <w:szCs w:val="20"/>
         </w:rPr>
-        <w:t xml:space="preserve">Version of 2026-10-03</w:t>
+        <w:t xml:space="preserve">Version of 2026-10-04</w:t>
       </w:r>
     </w:p>
     <w:p>
@@ -1008,6 +1008,32 @@
           <w:sz w:val="19"/>
           <w:szCs w:val="19"/>
         </w:rPr>
+        <w:t xml:space="preserve">Replacement price difference: how it was paid, and the day</w:t>
+      </w:r>
+    </w:p>
+    <w:p>
+      <w:pPr>
+        <w:spacing w:after="10" w:before="10"/>
+      </w:pPr>
+      <w:r>
+        <w:rPr>
+          <w:rFonts w:ascii="Arial" w:cs="Arial" w:eastAsia="Arial" w:hAnsi="Arial"/>
+          <w:sz w:val="19"/>
+          <w:szCs w:val="19"/>
+        </w:rPr>
+        <w:t xml:space="preserve">Choosing items from a search box</w:t>
+      </w:r>
+    </w:p>
+    <w:p>
+      <w:pPr>
+        <w:spacing w:after="10" w:before="10"/>
+      </w:pPr>
+      <w:r>
+        <w:rPr>
+          <w:rFonts w:ascii="Arial" w:cs="Arial" w:eastAsia="Arial" w:hAnsi="Arial"/>
+          <w:sz w:val="19"/>
+          <w:szCs w:val="19"/>
+        </w:rPr>
         <w:t xml:space="preserve">Email and SMS campaigns</w:t>
       </w:r>
     </w:p>
@@ -16456,6 +16482,394 @@
           <w:szCs w:val="20"/>
         </w:rPr>
         <w:t xml:space="preserve"> with a reason: everyone concerned is told and the memo is withdrawn.</w:t>
+      </w:r>
+    </w:p>
+    <w:p>
+      <w:pPr>
+        <w:pStyle w:val="Heading2"/>
+        <w:keepNext/>
+        <w:spacing w:after="100" w:before="320"/>
+      </w:pPr>
+      <w:r>
+        <w:rPr>
+          <w:rFonts w:ascii="Arial" w:cs="Arial" w:eastAsia="Arial" w:hAnsi="Arial"/>
+          <w:b/>
+          <w:bCs/>
+          <w:color w:val="0B1F3A"/>
+          <w:sz w:val="30"/>
+          <w:szCs w:val="30"/>
+        </w:rPr>
+        <w:t xml:space="preserve">Replacement price difference: how it was paid, and the day</w:t>
+      </w:r>
+    </w:p>
+    <w:p>
+      <w:pPr>
+        <w:spacing w:after="80" w:before="40" w:line="276"/>
+      </w:pPr>
+      <w:r>
+        <w:rPr>
+          <w:rFonts w:ascii="Arial" w:cs="Arial" w:eastAsia="Arial" w:hAnsi="Arial"/>
+          <w:b/>
+          <w:bCs/>
+          <w:sz w:val="20"/>
+          <w:szCs w:val="20"/>
+        </w:rPr>
+        <w:t xml:space="preserve">When the replacement is given</w:t>
+      </w:r>
+      <w:r>
+        <w:rPr>
+          <w:rFonts w:ascii="Arial" w:cs="Arial" w:eastAsia="Arial" w:hAnsi="Arial"/>
+          <w:sz w:val="20"/>
+          <w:szCs w:val="20"/>
+        </w:rPr>
+        <w:t xml:space="preserve"> (Replacement Tickets → open the ticket → </w:t>
+      </w:r>
+      <w:r>
+        <w:rPr>
+          <w:rFonts w:ascii="Arial" w:cs="Arial" w:eastAsia="Arial" w:hAnsi="Arial"/>
+          <w:i/>
+          <w:iCs/>
+          <w:sz w:val="20"/>
+          <w:szCs w:val="20"/>
+        </w:rPr>
+        <w:t xml:space="preserve">We gave the replacement</w:t>
+      </w:r>
+      <w:r>
+        <w:rPr>
+          <w:rFonts w:ascii="Arial" w:cs="Arial" w:eastAsia="Arial" w:hAnsi="Arial"/>
+          <w:sz w:val="20"/>
+          <w:szCs w:val="20"/>
+        </w:rPr>
+        <w:t xml:space="preserve">): choose the product (the box shows your choice; the price is filled in from the price list and you may change it) and the </w:t>
+      </w:r>
+      <w:r>
+        <w:rPr>
+          <w:rFonts w:ascii="Arial" w:cs="Arial" w:eastAsia="Arial" w:hAnsi="Arial"/>
+          <w:b/>
+          <w:bCs/>
+          <w:sz w:val="20"/>
+          <w:szCs w:val="20"/>
+        </w:rPr>
+        <w:t xml:space="preserve">day the replacement was given</w:t>
+      </w:r>
+      <w:r>
+        <w:rPr>
+          <w:rFonts w:ascii="Arial" w:cs="Arial" w:eastAsia="Arial" w:hAnsi="Arial"/>
+          <w:sz w:val="20"/>
+          <w:szCs w:val="20"/>
+        </w:rPr>
+        <w:t xml:space="preserve">. The stock leaves on that day, so that day's inventory changes. The Head Auditor approves every replacement; if the day is already closed the request says so.</w:t>
+      </w:r>
+    </w:p>
+    <w:p>
+      <w:pPr>
+        <w:spacing w:after="80" w:before="40" w:line="276"/>
+      </w:pPr>
+      <w:r>
+        <w:rPr>
+          <w:rFonts w:ascii="Arial" w:cs="Arial" w:eastAsia="Arial" w:hAnsi="Arial"/>
+          <w:b/>
+          <w:bCs/>
+          <w:sz w:val="20"/>
+          <w:szCs w:val="20"/>
+        </w:rPr>
+        <w:t xml:space="preserve">When the customer pays the difference (or is refunded):</w:t>
+      </w:r>
+      <w:r>
+        <w:rPr>
+          <w:rFonts w:ascii="Arial" w:cs="Arial" w:eastAsia="Arial" w:hAnsi="Arial"/>
+          <w:sz w:val="20"/>
+          <w:szCs w:val="20"/>
+        </w:rPr>
+        <w:t xml:space="preserve"> </w:t>
+      </w:r>
+      <w:r>
+        <w:rPr>
+          <w:rFonts w:ascii="Arial" w:cs="Arial" w:eastAsia="Arial" w:hAnsi="Arial"/>
+          <w:i/>
+          <w:iCs/>
+          <w:sz w:val="20"/>
+          <w:szCs w:val="20"/>
+        </w:rPr>
+        <w:t xml:space="preserve">Record the payment of the difference</w:t>
+      </w:r>
+      <w:r>
+        <w:rPr>
+          <w:rFonts w:ascii="Arial" w:cs="Arial" w:eastAsia="Arial" w:hAnsi="Arial"/>
+          <w:sz w:val="20"/>
+          <w:szCs w:val="20"/>
+        </w:rPr>
+        <w:t xml:space="preserve"> (or </w:t>
+      </w:r>
+      <w:r>
+        <w:rPr>
+          <w:rFonts w:ascii="Arial" w:cs="Arial" w:eastAsia="Arial" w:hAnsi="Arial"/>
+          <w:i/>
+          <w:iCs/>
+          <w:sz w:val="20"/>
+          <w:szCs w:val="20"/>
+        </w:rPr>
+        <w:t xml:space="preserve">the refund given</w:t>
+      </w:r>
+      <w:r>
+        <w:rPr>
+          <w:rFonts w:ascii="Arial" w:cs="Arial" w:eastAsia="Arial" w:hAnsi="Arial"/>
+          <w:sz w:val="20"/>
+          <w:szCs w:val="20"/>
+        </w:rPr>
+        <w:t xml:space="preserve">). Choose </w:t>
+      </w:r>
+      <w:r>
+        <w:rPr>
+          <w:rFonts w:ascii="Arial" w:cs="Arial" w:eastAsia="Arial" w:hAnsi="Arial"/>
+          <w:b/>
+          <w:bCs/>
+          <w:sz w:val="20"/>
+          <w:szCs w:val="20"/>
+        </w:rPr>
+        <w:t xml:space="preserve">how</w:t>
+      </w:r>
+      <w:r>
+        <w:rPr>
+          <w:rFonts w:ascii="Arial" w:cs="Arial" w:eastAsia="Arial" w:hAnsi="Arial"/>
+          <w:sz w:val="20"/>
+          <w:szCs w:val="20"/>
+        </w:rPr>
+        <w:t xml:space="preserve">: cash, online (pick the bank / GCash account) or credit card, and the </w:t>
+      </w:r>
+      <w:r>
+        <w:rPr>
+          <w:rFonts w:ascii="Arial" w:cs="Arial" w:eastAsia="Arial" w:hAnsi="Arial"/>
+          <w:b/>
+          <w:bCs/>
+          <w:sz w:val="20"/>
+          <w:szCs w:val="20"/>
+        </w:rPr>
+        <w:t xml:space="preserve">day</w:t>
+      </w:r>
+      <w:r>
+        <w:rPr>
+          <w:rFonts w:ascii="Arial" w:cs="Arial" w:eastAsia="Arial" w:hAnsi="Arial"/>
+          <w:sz w:val="20"/>
+          <w:szCs w:val="20"/>
+        </w:rPr>
+        <w:t xml:space="preserve"> it was paid. It then appears in the </w:t>
+      </w:r>
+      <w:r>
+        <w:rPr>
+          <w:rFonts w:ascii="Arial" w:cs="Arial" w:eastAsia="Arial" w:hAnsi="Arial"/>
+          <w:b/>
+          <w:bCs/>
+          <w:sz w:val="20"/>
+          <w:szCs w:val="20"/>
+        </w:rPr>
+        <w:t xml:space="preserve">Daily Sales Report of that day under Replacement payments</w:t>
+      </w:r>
+      <w:r>
+        <w:rPr>
+          <w:rFonts w:ascii="Arial" w:cs="Arial" w:eastAsia="Arial" w:hAnsi="Arial"/>
+          <w:sz w:val="20"/>
+          <w:szCs w:val="20"/>
+        </w:rPr>
+        <w:t xml:space="preserve">, apart from normal sales: cash joins the day's cash and deposit, online and card show with their account. The Excel report has its own sheet </w:t>
+      </w:r>
+      <w:r>
+        <w:rPr>
+          <w:rFonts w:ascii="Arial" w:cs="Arial" w:eastAsia="Arial" w:hAnsi="Arial"/>
+          <w:i/>
+          <w:iCs/>
+          <w:sz w:val="20"/>
+          <w:szCs w:val="20"/>
+        </w:rPr>
+        <w:t xml:space="preserve">REPLACEMENT PAYMENTS</w:t>
+      </w:r>
+      <w:r>
+        <w:rPr>
+          <w:rFonts w:ascii="Arial" w:cs="Arial" w:eastAsia="Arial" w:hAnsi="Arial"/>
+          <w:sz w:val="20"/>
+          <w:szCs w:val="20"/>
+        </w:rPr>
+        <w:t xml:space="preserve">; Daily Close shows it in the expected cash. A sale made on credit puts the difference on the customer's receivable instead.</w:t>
+      </w:r>
+    </w:p>
+    <w:p>
+      <w:pPr>
+        <w:spacing w:after="80" w:before="40" w:line="276"/>
+      </w:pPr>
+      <w:r>
+        <w:rPr>
+          <w:rFonts w:ascii="Arial" w:cs="Arial" w:eastAsia="Arial" w:hAnsi="Arial"/>
+          <w:b/>
+          <w:bCs/>
+          <w:sz w:val="20"/>
+          <w:szCs w:val="20"/>
+        </w:rPr>
+        <w:t xml:space="preserve">A day that is already closed</w:t>
+      </w:r>
+      <w:r>
+        <w:rPr>
+          <w:rFonts w:ascii="Arial" w:cs="Arial" w:eastAsia="Arial" w:hAnsi="Arial"/>
+          <w:sz w:val="20"/>
+          <w:szCs w:val="20"/>
+        </w:rPr>
+        <w:t xml:space="preserve"> needs the </w:t>
+      </w:r>
+      <w:r>
+        <w:rPr>
+          <w:rFonts w:ascii="Arial" w:cs="Arial" w:eastAsia="Arial" w:hAnsi="Arial"/>
+          <w:b/>
+          <w:bCs/>
+          <w:sz w:val="20"/>
+          <w:szCs w:val="20"/>
+        </w:rPr>
+        <w:t xml:space="preserve">Head Auditor's approval</w:t>
+      </w:r>
+      <w:r>
+        <w:rPr>
+          <w:rFonts w:ascii="Arial" w:cs="Arial" w:eastAsia="Arial" w:hAnsi="Arial"/>
+          <w:sz w:val="20"/>
+          <w:szCs w:val="20"/>
+        </w:rPr>
+        <w:t xml:space="preserve"> (My Approvals → </w:t>
+      </w:r>
+      <w:r>
+        <w:rPr>
+          <w:rFonts w:ascii="Arial" w:cs="Arial" w:eastAsia="Arial" w:hAnsi="Arial"/>
+          <w:i/>
+          <w:iCs/>
+          <w:sz w:val="20"/>
+          <w:szCs w:val="20"/>
+        </w:rPr>
+        <w:t xml:space="preserve">Replacement payment dated on a closed day</w:t>
+      </w:r>
+      <w:r>
+        <w:rPr>
+          <w:rFonts w:ascii="Arial" w:cs="Arial" w:eastAsia="Arial" w:hAnsi="Arial"/>
+          <w:sz w:val="20"/>
+          <w:szCs w:val="20"/>
+        </w:rPr>
+        <w:t xml:space="preserve">). Until then it is not in that day's report. If it is not approved, record it again with the right day. The Head Auditor recording it himself needs no second approval.</w:t>
+      </w:r>
+    </w:p>
+    <w:p>
+      <w:pPr>
+        <w:pStyle w:val="Heading2"/>
+        <w:keepNext/>
+        <w:spacing w:after="100" w:before="320"/>
+      </w:pPr>
+      <w:r>
+        <w:rPr>
+          <w:rFonts w:ascii="Arial" w:cs="Arial" w:eastAsia="Arial" w:hAnsi="Arial"/>
+          <w:b/>
+          <w:bCs/>
+          <w:color w:val="0B1F3A"/>
+          <w:sz w:val="30"/>
+          <w:szCs w:val="30"/>
+        </w:rPr>
+        <w:t xml:space="preserve">Choosing items from a search box</w:t>
+      </w:r>
+    </w:p>
+    <w:p>
+      <w:pPr>
+        <w:spacing w:after="80" w:before="40" w:line="276"/>
+      </w:pPr>
+      <w:r>
+        <w:rPr>
+          <w:rFonts w:ascii="Arial" w:cs="Arial" w:eastAsia="Arial" w:hAnsi="Arial"/>
+          <w:sz w:val="20"/>
+          <w:szCs w:val="20"/>
+        </w:rPr>
+        <w:t xml:space="preserve">Wherever you choose </w:t>
+      </w:r>
+      <w:r>
+        <w:rPr>
+          <w:rFonts w:ascii="Arial" w:cs="Arial" w:eastAsia="Arial" w:hAnsi="Arial"/>
+          <w:b/>
+          <w:bCs/>
+          <w:sz w:val="20"/>
+          <w:szCs w:val="20"/>
+        </w:rPr>
+        <w:t xml:space="preserve">one</w:t>
+      </w:r>
+      <w:r>
+        <w:rPr>
+          <w:rFonts w:ascii="Arial" w:cs="Arial" w:eastAsia="Arial" w:hAnsi="Arial"/>
+          <w:sz w:val="20"/>
+          <w:szCs w:val="20"/>
+        </w:rPr>
+        <w:t xml:space="preserve"> item from a search (a product, an outlet, the product given in a replacement…), the item you pick is shown </w:t>
+      </w:r>
+      <w:r>
+        <w:rPr>
+          <w:rFonts w:ascii="Arial" w:cs="Arial" w:eastAsia="Arial" w:hAnsi="Arial"/>
+          <w:b/>
+          <w:bCs/>
+          <w:sz w:val="20"/>
+          <w:szCs w:val="20"/>
+        </w:rPr>
+        <w:t xml:space="preserve">inside the box</w:t>
+      </w:r>
+      <w:r>
+        <w:rPr>
+          <w:rFonts w:ascii="Arial" w:cs="Arial" w:eastAsia="Arial" w:hAnsi="Arial"/>
+          <w:sz w:val="20"/>
+          <w:szCs w:val="20"/>
+        </w:rPr>
+        <w:t xml:space="preserve"> with a </w:t>
+      </w:r>
+      <w:r>
+        <w:rPr>
+          <w:rFonts w:ascii="Arial" w:cs="Arial" w:eastAsia="Arial" w:hAnsi="Arial"/>
+          <w:i/>
+          <w:iCs/>
+          <w:sz w:val="20"/>
+          <w:szCs w:val="20"/>
+        </w:rPr>
+        <w:t xml:space="preserve">✕ change</w:t>
+      </w:r>
+      <w:r>
+        <w:rPr>
+          <w:rFonts w:ascii="Arial" w:cs="Arial" w:eastAsia="Arial" w:hAnsi="Arial"/>
+          <w:sz w:val="20"/>
+          <w:szCs w:val="20"/>
+        </w:rPr>
+        <w:t xml:space="preserve"> button, so there is no doubt what is chosen. Prices that depend on the item (the replacement price, a member price, a promo price) are </w:t>
+      </w:r>
+      <w:r>
+        <w:rPr>
+          <w:rFonts w:ascii="Arial" w:cs="Arial" w:eastAsia="Arial" w:hAnsi="Arial"/>
+          <w:b/>
+          <w:bCs/>
+          <w:sz w:val="20"/>
+          <w:szCs w:val="20"/>
+        </w:rPr>
+        <w:t xml:space="preserve">filled in for you</w:t>
+      </w:r>
+      <w:r>
+        <w:rPr>
+          <w:rFonts w:ascii="Arial" w:cs="Arial" w:eastAsia="Arial" w:hAnsi="Arial"/>
+          <w:sz w:val="20"/>
+          <w:szCs w:val="20"/>
+        </w:rPr>
+        <w:t xml:space="preserve"> and can always be changed. At </w:t>
+      </w:r>
+      <w:r>
+        <w:rPr>
+          <w:rFonts w:ascii="Arial" w:cs="Arial" w:eastAsia="Arial" w:hAnsi="Arial"/>
+          <w:b/>
+          <w:bCs/>
+          <w:sz w:val="20"/>
+          <w:szCs w:val="20"/>
+        </w:rPr>
+        <w:t xml:space="preserve">New Sale</w:t>
+      </w:r>
+      <w:r>
+        <w:rPr>
+          <w:rFonts w:ascii="Arial" w:cs="Arial" w:eastAsia="Arial" w:hAnsi="Arial"/>
+          <w:sz w:val="20"/>
+          <w:szCs w:val="20"/>
+        </w:rPr>
+        <w:t xml:space="preserve">, member prices and running promo prices fill the price box by themselves; edit the box to charge something else.</w:t>
       </w:r>
     </w:p>
     <w:p>

</xml_diff>